<commit_message>
PROFANE ATTACK v1.5: sell mercenaries and jihadists too
- SELL first shows what you have (REL r MERC m JIH j), then asks
  SELL R)EL M)ERC J)IHAD?; mercenaries sell for 100 gold, jihadists for
  400 (less than they cost), relics at the random price as before
- you cannot sell your last people (KEEP SOMEONE!); NOTHING TO SELL when
  you have none of the chosen item; the sell menu comes back after a sale
- simulations: the difficulty curve stays the same
- new tape recording (4747 bytes without REM lines, 8 s leader);
  instructions_v1.5 and README updated

Co-Authored-By: Claude Opus 5.5 <noreply@anthropic.com>
Claude-Session: https://claude.ai/code/session_014MnrG7cc1Hws3poqmcDFnM
</commit_message>
<xml_diff>
--- a/instructions_v1.5.docx
+++ b/instructions_v1.5.docx
@@ -319,7 +319,7 @@
         <w:rPr>
           <w:lang w:val="en-GB"/>
         </w:rPr>
-        <w:t xml:space="preserve"> with a RAM module (CE-151 or larger). The recording holds the program without its REM lines (4425 bytes); with its variables it needs about 5 KB of memory, so it does not fit into a PC-1500 or PC-2 without a module.</w:t>
+        <w:t xml:space="preserve"> with a RAM module (CE-151 or larger). The recording holds the program without its REM lines (4747 bytes); with its variables it needs about 5.5 KB of memory, so it does not fit into a PC-1500 or PC-2 without a module.</w:t>
       </w:r>
     </w:p>
     <w:p>
@@ -483,7 +483,7 @@
         <w:rPr>
           <w:lang w:val="en-GB"/>
         </w:rPr>
-        <w:t>, about 5 minutes). If the program does not load, try again with another volume.</w:t>
+        <w:t>, about 6 minutes). If the program does not load, try again with another volume.</w:t>
       </w:r>
     </w:p>
     <w:p>
@@ -542,7 +542,7 @@
         <w:rPr>
           <w:lang w:val="en-GB"/>
         </w:rPr>
-        <w:t>. Leave out the REM lines: the recording does not contain them either, and with them the program would fill almost all the memory of a PC-1500A. The place names and treasures in lines 970–986 contain small letters (SML key).</w:t>
+        <w:t>. Leave out the REM lines: the recording does not contain them either, and with them the program would not leave enough memory for its variables on a PC-1500A. The place names and treasures in lines 970–986 contain small letters (SML key).</w:t>
       </w:r>
     </w:p>
     <w:p>
@@ -900,7 +900,7 @@
               <w:keepNext/>
             </w:pPr>
             <w:r>
-              <w:t>Sell relics (section 9)</w:t>
+              <w:t>Sell relics, mercenaries and jihadists (section 9)</w:t>
             </w:r>
           </w:p>
         </w:tc>
@@ -4742,6 +4742,7 @@
     </w:p>
     <w:p>
       <w:pPr>
+        <w:keepNext/>
         <w:spacing w:after="120"/>
         <w:rPr>
           <w:lang w:val="en-GB"/>
@@ -4759,65 +4760,558 @@
           <w:bCs/>
           <w:lang w:val="en-GB"/>
         </w:rPr>
-        <w:t>S</w:t>
-      </w:r>
-      <w:r>
-        <w:rPr>
-          <w:lang w:val="en-GB"/>
-        </w:rPr>
-        <w:t xml:space="preserve"> to sell relics. The game shows the price of one relic, e.g. </w:t>
+        <w:t xml:space="preserve">S</w:t>
+      </w:r>
+      <w:r>
+        <w:rPr>
+          <w:lang w:val="en-GB"/>
+        </w:rPr>
+        <w:t xml:space="preserve">. The game first shows what you have to sell, e.g. </w:t>
       </w:r>
       <w:r>
         <w:rPr>
           <w:rFonts w:ascii="Courier New" w:eastAsia="Courier New" w:hAnsi="Courier New" w:cs="Courier New"/>
           <w:lang w:val="en-GB"/>
         </w:rPr>
-        <w:t>1 RELIC = p GOLD</w:t>
-      </w:r>
-      <w:r>
-        <w:rPr>
-          <w:lang w:val="en-GB"/>
-        </w:rPr>
-        <w:t xml:space="preserve">. The price is random. It stays the same until your next fight and then changes. </w:t>
+        <w:t xml:space="preserve">REL 9 MERC 12 JIH 2</w:t>
+      </w:r>
+      <w:r>
+        <w:rPr>
+          <w:lang w:val="en-GB"/>
+        </w:rPr>
+        <w:t xml:space="preserve"> (relics, mercenaries, jihadists), then asks </w:t>
       </w:r>
       <w:r>
         <w:rPr>
           <w:rFonts w:ascii="Courier New" w:eastAsia="Courier New" w:hAnsi="Courier New" w:cs="Courier New"/>
           <w:lang w:val="en-GB"/>
         </w:rPr>
-        <w:t>SELL HOW MANY?</w:t>
-      </w:r>
-      <w:r>
-        <w:rPr>
-          <w:lang w:val="en-GB"/>
-        </w:rPr>
-        <w:t xml:space="preserve">: type a number (0 keeps all relics); the game shows </w:t>
+        <w:t xml:space="preserve">SELL R)EL M)ERC J)IHAD?</w:t>
+      </w:r>
+      <w:r>
+        <w:rPr>
+          <w:lang w:val="en-GB"/>
+        </w:rPr>
+        <w:t xml:space="preserve">:</w:t>
+      </w:r>
+    </w:p>
+    <w:tbl>
+      <w:tblPr>
+        <w:tblW w:w="7638" w:type="dxa"/>
+        <w:tblBorders>
+          <w:top w:val="single" w:sz="4" w:space="0" w:color="auto"/>
+          <w:left w:val="single" w:sz="4" w:space="0" w:color="auto"/>
+          <w:bottom w:val="single" w:sz="4" w:space="0" w:color="auto"/>
+          <w:right w:val="single" w:sz="4" w:space="0" w:color="auto"/>
+          <w:insideH w:val="single" w:sz="4" w:space="0" w:color="auto"/>
+          <w:insideV w:val="single" w:sz="4" w:space="0" w:color="auto"/>
+        </w:tblBorders>
+        <w:tblCellMar>
+          <w:left w:w="10" w:type="dxa"/>
+          <w:right w:w="10" w:type="dxa"/>
+        </w:tblCellMar>
+        <w:tblLook w:val="04A0" w:firstRow="1" w:lastRow="0" w:firstColumn="1" w:lastColumn="0" w:noHBand="0" w:noVBand="1"/>
+      </w:tblPr>
+      <w:tblGrid>
+        <w:gridCol w:w="1400"/>
+        <w:gridCol w:w="4238"/>
+        <w:gridCol w:w="2000"/>
+      </w:tblGrid>
+      <w:tr>
+        <w:tblPrEx>
+          <w:tblCellMar>
+            <w:top w:w="0" w:type="dxa"/>
+            <w:bottom w:w="0" w:type="dxa"/>
+          </w:tblCellMar>
+        </w:tblPrEx>
+        <w:trPr>
+          <w:cantSplit/>
+          <w:tblHeader/>
+        </w:trPr>
+        <w:tc>
+          <w:tcPr>
+            <w:tcW w:w="1400" w:type="dxa"/>
+            <w:tcBorders>
+              <w:top w:val="single" w:sz="4" w:space="0" w:color="999999"/>
+              <w:left w:val="single" w:sz="4" w:space="0" w:color="999999"/>
+              <w:bottom w:val="single" w:sz="4" w:space="0" w:color="999999"/>
+              <w:right w:val="single" w:sz="4" w:space="0" w:color="999999"/>
+            </w:tcBorders>
+            <w:shd w:val="clear" w:color="auto" w:fill="D9E2F3"/>
+            <w:tcMar>
+              <w:top w:w="30" w:type="dxa"/>
+              <w:left w:w="100" w:type="dxa"/>
+              <w:bottom w:w="30" w:type="dxa"/>
+              <w:right w:w="100" w:type="dxa"/>
+            </w:tcMar>
+          </w:tcPr>
+          <w:p>
+            <w:pPr>
+              <w:keepNext/>
+            </w:pPr>
+            <w:r>
+              <w:rPr>
+                <w:b/>
+                <w:bCs/>
+              </w:rPr>
+              <w:t>Key</w:t>
+            </w:r>
+          </w:p>
+        </w:tc>
+        <w:tc>
+          <w:tcPr>
+            <w:tcW w:w="4238" w:type="dxa"/>
+            <w:tcBorders>
+              <w:top w:val="single" w:sz="4" w:space="0" w:color="999999"/>
+              <w:left w:val="single" w:sz="4" w:space="0" w:color="999999"/>
+              <w:bottom w:val="single" w:sz="4" w:space="0" w:color="999999"/>
+              <w:right w:val="single" w:sz="4" w:space="0" w:color="999999"/>
+            </w:tcBorders>
+            <w:shd w:val="clear" w:color="auto" w:fill="D9E2F3"/>
+            <w:tcMar>
+              <w:top w:w="30" w:type="dxa"/>
+              <w:left w:w="100" w:type="dxa"/>
+              <w:bottom w:w="30" w:type="dxa"/>
+              <w:right w:w="100" w:type="dxa"/>
+            </w:tcMar>
+          </w:tcPr>
+          <w:p>
+            <w:pPr>
+              <w:keepNext/>
+            </w:pPr>
+            <w:r>
+              <w:rPr>
+                <w:b/>
+                <w:bCs/>
+              </w:rPr>
+              <w:t>Item</w:t>
+            </w:r>
+          </w:p>
+        </w:tc>
+        <w:tc>
+          <w:tcPr>
+            <w:tcW w:w="2000" w:type="dxa"/>
+            <w:tcBorders>
+              <w:top w:val="single" w:sz="4" w:space="0" w:color="999999"/>
+              <w:left w:val="single" w:sz="4" w:space="0" w:color="999999"/>
+              <w:bottom w:val="single" w:sz="4" w:space="0" w:color="999999"/>
+              <w:right w:val="single" w:sz="4" w:space="0" w:color="999999"/>
+            </w:tcBorders>
+            <w:shd w:val="clear" w:color="auto" w:fill="D9E2F3"/>
+            <w:tcMar>
+              <w:top w:w="30" w:type="dxa"/>
+              <w:left w:w="100" w:type="dxa"/>
+              <w:bottom w:w="30" w:type="dxa"/>
+              <w:right w:w="100" w:type="dxa"/>
+            </w:tcMar>
+          </w:tcPr>
+          <w:p>
+            <w:pPr>
+              <w:keepNext/>
+            </w:pPr>
+            <w:r>
+              <w:rPr>
+                <w:b/>
+                <w:bCs/>
+              </w:rPr>
+              <w:t>Price (gold)</w:t>
+            </w:r>
+          </w:p>
+        </w:tc>
+      </w:tr>
+      <w:tr>
+        <w:tblPrEx>
+          <w:tblCellMar>
+            <w:top w:w="0" w:type="dxa"/>
+            <w:bottom w:w="0" w:type="dxa"/>
+          </w:tblCellMar>
+        </w:tblPrEx>
+        <w:trPr>
+          <w:cantSplit/>
+        </w:trPr>
+        <w:tc>
+          <w:tcPr>
+            <w:tcW w:w="1400" w:type="dxa"/>
+            <w:tcBorders>
+              <w:top w:val="single" w:sz="4" w:space="0" w:color="999999"/>
+              <w:left w:val="single" w:sz="4" w:space="0" w:color="999999"/>
+              <w:bottom w:val="single" w:sz="4" w:space="0" w:color="999999"/>
+              <w:right w:val="single" w:sz="4" w:space="0" w:color="999999"/>
+            </w:tcBorders>
+            <w:tcMar>
+              <w:top w:w="30" w:type="dxa"/>
+              <w:left w:w="100" w:type="dxa"/>
+              <w:bottom w:w="30" w:type="dxa"/>
+              <w:right w:w="100" w:type="dxa"/>
+            </w:tcMar>
+          </w:tcPr>
+          <w:p>
+            <w:pPr>
+              <w:keepNext/>
+            </w:pPr>
+            <w:r>
+              <w:t>R</w:t>
+            </w:r>
+          </w:p>
+        </w:tc>
+        <w:tc>
+          <w:tcPr>
+            <w:tcW w:w="4238" w:type="dxa"/>
+            <w:tcBorders>
+              <w:top w:val="single" w:sz="4" w:space="0" w:color="999999"/>
+              <w:left w:val="single" w:sz="4" w:space="0" w:color="999999"/>
+              <w:bottom w:val="single" w:sz="4" w:space="0" w:color="999999"/>
+              <w:right w:val="single" w:sz="4" w:space="0" w:color="999999"/>
+            </w:tcBorders>
+            <w:tcMar>
+              <w:top w:w="30" w:type="dxa"/>
+              <w:left w:w="100" w:type="dxa"/>
+              <w:bottom w:w="30" w:type="dxa"/>
+              <w:right w:w="100" w:type="dxa"/>
+            </w:tcMar>
+          </w:tcPr>
+          <w:p>
+            <w:pPr>
+              <w:keepNext/>
+            </w:pPr>
+            <w:r>
+              <w:t>Relic</w:t>
+            </w:r>
+          </w:p>
+        </w:tc>
+        <w:tc>
+          <w:tcPr>
+            <w:tcW w:w="2000" w:type="dxa"/>
+            <w:tcBorders>
+              <w:top w:val="single" w:sz="4" w:space="0" w:color="999999"/>
+              <w:left w:val="single" w:sz="4" w:space="0" w:color="999999"/>
+              <w:bottom w:val="single" w:sz="4" w:space="0" w:color="999999"/>
+              <w:right w:val="single" w:sz="4" w:space="0" w:color="999999"/>
+            </w:tcBorders>
+            <w:tcMar>
+              <w:top w:w="30" w:type="dxa"/>
+              <w:left w:w="100" w:type="dxa"/>
+              <w:bottom w:w="30" w:type="dxa"/>
+              <w:right w:w="100" w:type="dxa"/>
+            </w:tcMar>
+          </w:tcPr>
+          <w:p>
+            <w:pPr>
+              <w:keepNext/>
+              <w:jc w:val="right"/>
+            </w:pPr>
+            <w:r>
+              <w:t>random</w:t>
+            </w:r>
+          </w:p>
+        </w:tc>
+      </w:tr>
+      <w:tr>
+        <w:tblPrEx>
+          <w:tblCellMar>
+            <w:top w:w="0" w:type="dxa"/>
+            <w:bottom w:w="0" w:type="dxa"/>
+          </w:tblCellMar>
+        </w:tblPrEx>
+        <w:trPr>
+          <w:cantSplit/>
+        </w:trPr>
+        <w:tc>
+          <w:tcPr>
+            <w:tcW w:w="1400" w:type="dxa"/>
+            <w:tcBorders>
+              <w:top w:val="single" w:sz="4" w:space="0" w:color="999999"/>
+              <w:left w:val="single" w:sz="4" w:space="0" w:color="999999"/>
+              <w:bottom w:val="single" w:sz="4" w:space="0" w:color="999999"/>
+              <w:right w:val="single" w:sz="4" w:space="0" w:color="999999"/>
+            </w:tcBorders>
+            <w:tcMar>
+              <w:top w:w="30" w:type="dxa"/>
+              <w:left w:w="100" w:type="dxa"/>
+              <w:bottom w:w="30" w:type="dxa"/>
+              <w:right w:w="100" w:type="dxa"/>
+            </w:tcMar>
+          </w:tcPr>
+          <w:p>
+            <w:pPr>
+              <w:keepNext/>
+            </w:pPr>
+            <w:r>
+              <w:t>M</w:t>
+            </w:r>
+          </w:p>
+        </w:tc>
+        <w:tc>
+          <w:tcPr>
+            <w:tcW w:w="4238" w:type="dxa"/>
+            <w:tcBorders>
+              <w:top w:val="single" w:sz="4" w:space="0" w:color="999999"/>
+              <w:left w:val="single" w:sz="4" w:space="0" w:color="999999"/>
+              <w:bottom w:val="single" w:sz="4" w:space="0" w:color="999999"/>
+              <w:right w:val="single" w:sz="4" w:space="0" w:color="999999"/>
+            </w:tcBorders>
+            <w:tcMar>
+              <w:top w:w="30" w:type="dxa"/>
+              <w:left w:w="100" w:type="dxa"/>
+              <w:bottom w:w="30" w:type="dxa"/>
+              <w:right w:w="100" w:type="dxa"/>
+            </w:tcMar>
+          </w:tcPr>
+          <w:p>
+            <w:pPr>
+              <w:keepNext/>
+            </w:pPr>
+            <w:r>
+              <w:t>Mercenary</w:t>
+            </w:r>
+          </w:p>
+        </w:tc>
+        <w:tc>
+          <w:tcPr>
+            <w:tcW w:w="2000" w:type="dxa"/>
+            <w:tcBorders>
+              <w:top w:val="single" w:sz="4" w:space="0" w:color="999999"/>
+              <w:left w:val="single" w:sz="4" w:space="0" w:color="999999"/>
+              <w:bottom w:val="single" w:sz="4" w:space="0" w:color="999999"/>
+              <w:right w:val="single" w:sz="4" w:space="0" w:color="999999"/>
+            </w:tcBorders>
+            <w:tcMar>
+              <w:top w:w="30" w:type="dxa"/>
+              <w:left w:w="100" w:type="dxa"/>
+              <w:bottom w:w="30" w:type="dxa"/>
+              <w:right w:w="100" w:type="dxa"/>
+            </w:tcMar>
+          </w:tcPr>
+          <w:p>
+            <w:pPr>
+              <w:keepNext/>
+              <w:jc w:val="right"/>
+            </w:pPr>
+            <w:r>
+              <w:t>100</w:t>
+            </w:r>
+          </w:p>
+        </w:tc>
+      </w:tr>
+      <w:tr>
+        <w:tblPrEx>
+          <w:tblCellMar>
+            <w:top w:w="0" w:type="dxa"/>
+            <w:bottom w:w="0" w:type="dxa"/>
+          </w:tblCellMar>
+        </w:tblPrEx>
+        <w:trPr>
+          <w:cantSplit/>
+        </w:trPr>
+        <w:tc>
+          <w:tcPr>
+            <w:tcW w:w="1400" w:type="dxa"/>
+            <w:tcBorders>
+              <w:top w:val="single" w:sz="4" w:space="0" w:color="999999"/>
+              <w:left w:val="single" w:sz="4" w:space="0" w:color="999999"/>
+              <w:bottom w:val="single" w:sz="4" w:space="0" w:color="999999"/>
+              <w:right w:val="single" w:sz="4" w:space="0" w:color="999999"/>
+            </w:tcBorders>
+            <w:tcMar>
+              <w:top w:w="30" w:type="dxa"/>
+              <w:left w:w="100" w:type="dxa"/>
+              <w:bottom w:w="30" w:type="dxa"/>
+              <w:right w:w="100" w:type="dxa"/>
+            </w:tcMar>
+          </w:tcPr>
+          <w:p>
+            <w:r>
+              <w:t>J</w:t>
+            </w:r>
+          </w:p>
+        </w:tc>
+        <w:tc>
+          <w:tcPr>
+            <w:tcW w:w="4238" w:type="dxa"/>
+            <w:tcBorders>
+              <w:top w:val="single" w:sz="4" w:space="0" w:color="999999"/>
+              <w:left w:val="single" w:sz="4" w:space="0" w:color="999999"/>
+              <w:bottom w:val="single" w:sz="4" w:space="0" w:color="999999"/>
+              <w:right w:val="single" w:sz="4" w:space="0" w:color="999999"/>
+            </w:tcBorders>
+            <w:tcMar>
+              <w:top w:w="30" w:type="dxa"/>
+              <w:left w:w="100" w:type="dxa"/>
+              <w:bottom w:w="30" w:type="dxa"/>
+              <w:right w:w="100" w:type="dxa"/>
+            </w:tcMar>
+          </w:tcPr>
+          <w:p>
+            <w:r>
+              <w:t>Jihadist</w:t>
+            </w:r>
+          </w:p>
+        </w:tc>
+        <w:tc>
+          <w:tcPr>
+            <w:tcW w:w="2000" w:type="dxa"/>
+            <w:tcBorders>
+              <w:top w:val="single" w:sz="4" w:space="0" w:color="999999"/>
+              <w:left w:val="single" w:sz="4" w:space="0" w:color="999999"/>
+              <w:bottom w:val="single" w:sz="4" w:space="0" w:color="999999"/>
+              <w:right w:val="single" w:sz="4" w:space="0" w:color="999999"/>
+            </w:tcBorders>
+            <w:tcMar>
+              <w:top w:w="30" w:type="dxa"/>
+              <w:left w:w="100" w:type="dxa"/>
+              <w:bottom w:w="30" w:type="dxa"/>
+              <w:right w:w="100" w:type="dxa"/>
+            </w:tcMar>
+          </w:tcPr>
+          <w:p>
+            <w:pPr>
+              <w:jc w:val="right"/>
+            </w:pPr>
+            <w:r>
+              <w:t>400</w:t>
+            </w:r>
+          </w:p>
+        </w:tc>
+      </w:tr>
+    </w:tbl>
+    <w:p>
+      <w:pPr>
+        <w:spacing w:after="120"/>
+      </w:pPr>
+    </w:p>
+    <w:p>
+      <w:pPr>
+        <w:spacing w:after="120"/>
+        <w:rPr>
+          <w:lang w:val="en-GB"/>
+        </w:rPr>
+      </w:pPr>
+      <w:r>
+        <w:rPr>
+          <w:lang w:val="en-GB"/>
+        </w:rPr>
+        <w:t xml:space="preserve">Press </w:t>
+      </w:r>
+      <w:r>
+        <w:rPr>
+          <w:b/>
+          <w:bCs/>
+          <w:lang w:val="en-GB"/>
+        </w:rPr>
+        <w:t xml:space="preserve">R</w:t>
+      </w:r>
+      <w:r>
+        <w:rPr>
+          <w:lang w:val="en-GB"/>
+        </w:rPr>
+        <w:t xml:space="preserve">, </w:t>
+      </w:r>
+      <w:r>
+        <w:rPr>
+          <w:b/>
+          <w:bCs/>
+          <w:lang w:val="en-GB"/>
+        </w:rPr>
+        <w:t xml:space="preserve">M</w:t>
+      </w:r>
+      <w:r>
+        <w:rPr>
+          <w:lang w:val="en-GB"/>
+        </w:rPr>
+        <w:t xml:space="preserve"> or </w:t>
+      </w:r>
+      <w:r>
+        <w:rPr>
+          <w:b/>
+          <w:bCs/>
+          <w:lang w:val="en-GB"/>
+        </w:rPr>
+        <w:t xml:space="preserve">J</w:t>
+      </w:r>
+      <w:r>
+        <w:rPr>
+          <w:lang w:val="en-GB"/>
+        </w:rPr>
+        <w:t xml:space="preserve">; any other key returns to the main menu. The game shows the price of one piece and how many you have, e.g. </w:t>
       </w:r>
       <w:r>
         <w:rPr>
           <w:rFonts w:ascii="Courier New" w:eastAsia="Courier New" w:hAnsi="Courier New" w:cs="Courier New"/>
           <w:lang w:val="en-GB"/>
         </w:rPr>
-        <w:t>GOLD NOW g</w:t>
-      </w:r>
-      <w:r>
-        <w:rPr>
-          <w:lang w:val="en-GB"/>
-        </w:rPr>
-        <w:t xml:space="preserve">. Without relics: </w:t>
+        <w:t xml:space="preserve">PRICE 400 (MAX 2)</w:t>
+      </w:r>
+      <w:r>
+        <w:rPr>
+          <w:lang w:val="en-GB"/>
+        </w:rPr>
+        <w:t xml:space="preserve">, and asks </w:t>
       </w:r>
       <w:r>
         <w:rPr>
           <w:rFonts w:ascii="Courier New" w:eastAsia="Courier New" w:hAnsi="Courier New" w:cs="Courier New"/>
           <w:lang w:val="en-GB"/>
         </w:rPr>
-        <w:t>NO RELICS TO SELL</w:t>
-      </w:r>
-      <w:r>
-        <w:rPr>
-          <w:lang w:val="en-GB"/>
-        </w:rPr>
-        <w:t>.</w:t>
+        <w:t xml:space="preserve">SELL HOW MANY?</w:t>
+      </w:r>
+      <w:r>
+        <w:rPr>
+          <w:lang w:val="en-GB"/>
+        </w:rPr>
+        <w:t xml:space="preserve"> (0 sells nothing). Then it shows </w:t>
+      </w:r>
+      <w:r>
+        <w:rPr>
+          <w:rFonts w:ascii="Courier New" w:eastAsia="Courier New" w:hAnsi="Courier New" w:cs="Courier New"/>
+          <w:lang w:val="en-GB"/>
+        </w:rPr>
+        <w:t xml:space="preserve">GOLD NOW g</w:t>
+      </w:r>
+      <w:r>
+        <w:rPr>
+          <w:lang w:val="en-GB"/>
+        </w:rPr>
+        <w:t xml:space="preserve"> and the sell menu comes back.</w:t>
+      </w:r>
+    </w:p>
+    <w:p>
+      <w:pPr>
+        <w:spacing w:after="120"/>
+        <w:rPr>
+          <w:lang w:val="en-GB"/>
+        </w:rPr>
+      </w:pPr>
+      <w:r>
+        <w:rPr>
+          <w:lang w:val="en-GB"/>
+        </w:rPr>
+        <w:t xml:space="preserve">The price of a relic is random. It stays the same until your next fight and then changes. Mercenaries and jihadists sell for less than they cost. You cannot sell your last people: the game shows </w:t>
+      </w:r>
+      <w:r>
+        <w:rPr>
+          <w:rFonts w:ascii="Courier New" w:eastAsia="Courier New" w:hAnsi="Courier New" w:cs="Courier New"/>
+          <w:lang w:val="en-GB"/>
+        </w:rPr>
+        <w:t xml:space="preserve">KEEP SOMEONE!</w:t>
+      </w:r>
+      <w:r>
+        <w:rPr>
+          <w:lang w:val="en-GB"/>
+        </w:rPr>
+        <w:t xml:space="preserve">. If you have none of the chosen item, it shows </w:t>
+      </w:r>
+      <w:r>
+        <w:rPr>
+          <w:rFonts w:ascii="Courier New" w:eastAsia="Courier New" w:hAnsi="Courier New" w:cs="Courier New"/>
+          <w:lang w:val="en-GB"/>
+        </w:rPr>
+        <w:t xml:space="preserve">NOTHING TO SELL</w:t>
+      </w:r>
+      <w:r>
+        <w:rPr>
+          <w:lang w:val="en-GB"/>
+        </w:rPr>
+        <w:t xml:space="preserve">.</w:t>
       </w:r>
     </w:p>
     <w:p>
@@ -5231,6 +5725,22 @@
           <w:lang w:val="en-GB"/>
         </w:rPr>
         <w:t>Mercenaries are cheap insurance: they do not kill anyone, but with a few of them you can take fewer weapons into a fight. Too many of them only waste your gold.</w:t>
+      </w:r>
+    </w:p>
+    <w:p>
+      <w:pPr>
+        <w:pStyle w:val="Akapitzlist"/>
+        <w:numPr>
+          <w:ilvl w:val="0"/>
+          <w:numId w:val="2"/>
+        </w:numPr>
+        <w:spacing w:after="60"/>
+      </w:pPr>
+      <w:r>
+        <w:rPr>
+          <w:lang w:val="en-GB"/>
+        </w:rPr>
+        <w:t xml:space="preserve">Surplus mercenaries and jihadists can be sold for gold, but every one you sell is one fewer to take the militants' blows.</w:t>
       </w:r>
     </w:p>
     <w:p>

</xml_diff>

<commit_message>
PROFANE ATTACK v1.5: "Starting..." on the display while the game prepares
Line 25 shows Starting... before the places are computed, so the display
is not empty until the title and the menu appear. New tape recording
(4770 bytes without REM lines); instructions_v1.5 mention the new screen.

Co-Authored-By: Claude Opus 5.5 <noreply@anthropic.com>
Claude-Session: https://claude.ai/code/session_014MnrG7cc1Hws3poqmcDFnM
</commit_message>
<xml_diff>
--- a/instructions_v1.5.docx
+++ b/instructions_v1.5.docx
@@ -319,7 +319,7 @@
         <w:rPr>
           <w:lang w:val="en-GB"/>
         </w:rPr>
-        <w:t xml:space="preserve"> with a RAM module (CE-151 or larger). The recording holds the program without its REM lines (4747 bytes); with its variables it needs about 5.5 KB of memory, so it does not fit into a PC-1500 or PC-2 without a module.</w:t>
+        <w:t xml:space="preserve"> with a RAM module (CE-151 or larger). The recording holds the program without its REM lines (4770 bytes); with its variables it needs about 5.5 KB of memory, so it does not fit into a PC-1500 or PC-2 without a module.</w:t>
       </w:r>
     </w:p>
     <w:p>
@@ -570,7 +570,20 @@
         <w:rPr>
           <w:lang w:val="en-GB"/>
         </w:rPr>
-        <w:t xml:space="preserve">The game shows its title, then </w:t>
+        <w:t xml:space="preserve">The game shows </w:t>
+      </w:r>
+      <w:r>
+        <w:rPr>
+          <w:rFonts w:ascii="Courier New" w:eastAsia="Courier New" w:hAnsi="Courier New" w:cs="Courier New"/>
+          <w:lang w:val="en-GB"/>
+        </w:rPr>
+        <w:t>Starting...</w:t>
+      </w:r>
+      <w:r>
+        <w:rPr>
+          <w:lang w:val="en-GB"/>
+        </w:rPr>
+        <w:t xml:space="preserve"> while it prepares the places, then its title, then </w:t>
       </w:r>
       <w:r>
         <w:rPr>

</xml_diff>

<commit_message>
PROFANE ATTACK v1.5: the SELL overview waits for ENTER
Line 702 shows REL r MERC m JIH j until ENTER is pressed (was 2 s), then
the game asks what to sell. New tape recording (4767 bytes without REM
lines); instructions_v1.5 updated.

Co-Authored-By: Claude Opus 5.5 <noreply@anthropic.com>
Claude-Session: https://claude.ai/code/session_014MnrG7cc1Hws3poqmcDFnM
</commit_message>
<xml_diff>
--- a/instructions_v1.5.docx
+++ b/instructions_v1.5.docx
@@ -319,7 +319,7 @@
         <w:rPr>
           <w:lang w:val="en-GB"/>
         </w:rPr>
-        <w:t xml:space="preserve"> with a RAM module (CE-151 or larger). The recording holds the program without its REM lines (4770 bytes); with its variables it needs about 5.5 KB of memory, so it does not fit into a PC-1500 or PC-2 without a module.</w:t>
+        <w:t xml:space="preserve"> with a RAM module (CE-151 or larger). The recording holds the program without its REM lines (4767 bytes); with its variables it needs about 5.5 KB of memory, so it does not fit into a PC-1500 or PC-2 without a module.</w:t>
       </w:r>
     </w:p>
     <w:p>
@@ -4792,7 +4792,7 @@
         <w:rPr>
           <w:lang w:val="en-GB"/>
         </w:rPr>
-        <w:t xml:space="preserve"> (relics, mercenaries, jihadists), then asks </w:t>
+        <w:t xml:space="preserve"> (relics, mercenaries, jihadists) and waits for ENTER. Then it asks </w:t>
       </w:r>
       <w:r>
         <w:rPr>

</xml_diff>

<commit_message>
PROFANE ATTACK v1.5: new tape recording with BRIMSTONES in YOU HAVE
The author's change in line 760 (BRIM -> BRIMSTONES) is now in the tape
recording (4773 bytes without REM lines, 8 s leader). The widest line,
CROSS 1234 BRIMSTONES 1234, still fits the 26-character display.
instructions_v1.5: section 10 and the program size updated.

Co-Authored-By: Claude Opus 5.5 <noreply@anthropic.com>
Claude-Session: https://claude.ai/code/session_014MnrG7cc1Hws3poqmcDFnM
</commit_message>
<xml_diff>
--- a/instructions_v1.5.docx
+++ b/instructions_v1.5.docx
@@ -319,7 +319,7 @@
         <w:rPr>
           <w:lang w:val="en-GB"/>
         </w:rPr>
-        <w:t xml:space="preserve"> with a RAM module (CE-151 or larger). The recording holds the program without its REM lines (4767 bytes); with its variables it needs about 5.5 KB of memory, so it does not fit into a PC-1500 or PC-2 without a module.</w:t>
+        <w:t xml:space="preserve"> with a RAM module (CE-151 or larger). The recording holds the program without its REM lines (4773 bytes); with its variables it needs about 5.5 KB of memory, so it does not fit into a PC-1500 or PC-2 without a module.</w:t>
       </w:r>
     </w:p>
     <w:p>
@@ -5438,7 +5438,7 @@
           <w:rFonts w:ascii="Courier New" w:eastAsia="Courier New" w:hAnsi="Courier New" w:cs="Courier New"/>
           <w:lang w:val="en-GB"/>
         </w:rPr>
-        <w:t>BRIM</w:t>
+        <w:t>BRIMSTONES</w:t>
       </w:r>
       <w:r>
         <w:rPr>

</xml_diff>